<commit_message>
docs: regenerate 4 .docx customer frameworks with v8.1 numbers
Runs docs/generate-technical-doc(-nl).js + generate-legal-doc(-nl).js
after the script updates from 9fc7da1. Technical docs now include the
live v8.1 tier-accuracy table (82.5% / 71.7% / 60%+ / 48.4%) alongside
the walk-forward baseline, and the scheduler-cadence section matches
production APScheduler config (10m/20m). Legal docs unchanged in scope,
regenerated for consistency.

Co-Authored-By: Claude Opus 4.7 (1M context) <noreply@anthropic.com>
</commit_message>
<xml_diff>
--- a/docs/BetsPlug-Technical-Framework (ENG).docx
+++ b/docs/BetsPlug-Technical-Framework (ENG).docx
@@ -3572,7 +3572,7 @@
           <w:sz w:val="22"/>
           <w:szCs w:val="22"/>
         </w:rPr>
-        <w:t xml:space="preserve">Walk-forward results on 28,838 out-of-sample test picks:</w:t>
+        <w:t xml:space="preserve">Walk-forward results on 28,838 out-of-sample test picks (honest temporal validation):</w:t>
       </w:r>
     </w:p>
     <w:tbl>
@@ -4338,7 +4338,797 @@
           <w:sz w:val="22"/>
           <w:szCs w:val="22"/>
         </w:rPr>
-        <w:t xml:space="preserve">Interpretation: raw accuracy is modest because football 1X2 is hard (33% random baseline, ~50% best-case for all picks). Real value lies in confidence filtering — the model correctly abstains on uncertain matches. At ≥ 75% confidence, 78.2% accuracy represents a genuine edge.</w:t>
+        <w:t xml:space="preserve">Live v8.1 per-tier accuracy on the post-deploy evaluated set (updated continuously via /api/pricing/comparison):</w:t>
+      </w:r>
+    </w:p>
+    <w:tbl>
+      <w:tblPr>
+        <w:tblW w:type="dxa" w:w="9026"/>
+        <w:tblBorders>
+          <w:top w:val="single" w:color="auto" w:sz="4"/>
+          <w:left w:val="single" w:color="auto" w:sz="4"/>
+          <w:bottom w:val="single" w:color="auto" w:sz="4"/>
+          <w:right w:val="single" w:color="auto" w:sz="4"/>
+          <w:insideH w:val="single" w:color="auto" w:sz="4"/>
+          <w:insideV w:val="single" w:color="auto" w:sz="4"/>
+        </w:tblBorders>
+      </w:tblPr>
+      <w:tblGrid>
+        <w:gridCol w:w="4500"/>
+        <w:gridCol w:w="4526"/>
+      </w:tblGrid>
+      <w:tr>
+        <w:tc>
+          <w:tcPr>
+            <w:tcW w:type="dxa" w:w="4500"/>
+            <w:tcBorders>
+              <w:top w:val="single" w:color="cccccc" w:sz="1"/>
+              <w:left w:val="single" w:color="cccccc" w:sz="1"/>
+              <w:bottom w:val="single" w:color="cccccc" w:sz="1"/>
+              <w:right w:val="single" w:color="cccccc" w:sz="1"/>
+            </w:tcBorders>
+            <w:shd w:fill="e8f0fe" w:val="clear"/>
+            <w:tcMar>
+              <w:top w:type="dxa" w:w="80"/>
+              <w:left w:type="dxa" w:w="120"/>
+              <w:bottom w:type="dxa" w:w="80"/>
+              <w:right w:type="dxa" w:w="120"/>
+            </w:tcMar>
+          </w:tcPr>
+          <w:p>
+            <w:r>
+              <w:rPr>
+                <w:rFonts w:ascii="Arial" w:cs="Arial" w:eastAsia="Arial" w:hAnsi="Arial"/>
+                <w:b/>
+                <w:bCs/>
+                <w:sz w:val="20"/>
+                <w:szCs w:val="20"/>
+              </w:rPr>
+              <w:t xml:space="preserve">Tier</w:t>
+            </w:r>
+          </w:p>
+        </w:tc>
+        <w:tc>
+          <w:tcPr>
+            <w:tcW w:type="dxa" w:w="4526"/>
+            <w:tcBorders>
+              <w:top w:val="single" w:color="cccccc" w:sz="1"/>
+              <w:left w:val="single" w:color="cccccc" w:sz="1"/>
+              <w:bottom w:val="single" w:color="cccccc" w:sz="1"/>
+              <w:right w:val="single" w:color="cccccc" w:sz="1"/>
+            </w:tcBorders>
+            <w:shd w:fill="e8f0fe" w:val="clear"/>
+            <w:tcMar>
+              <w:top w:type="dxa" w:w="80"/>
+              <w:left w:type="dxa" w:w="120"/>
+              <w:bottom w:type="dxa" w:w="80"/>
+              <w:right w:type="dxa" w:w="120"/>
+            </w:tcMar>
+          </w:tcPr>
+          <w:p>
+            <w:r>
+              <w:rPr>
+                <w:rFonts w:ascii="Arial" w:cs="Arial" w:eastAsia="Arial" w:hAnsi="Arial"/>
+                <w:b/>
+                <w:bCs/>
+                <w:sz w:val="20"/>
+                <w:szCs w:val="20"/>
+              </w:rPr>
+              <w:t xml:space="preserve">League scope</w:t>
+            </w:r>
+          </w:p>
+        </w:tc>
+        <w:tc>
+          <w:tcPr>
+            <w:tcW w:type="dxa" w:w="4526"/>
+            <w:tcBorders>
+              <w:top w:val="single" w:color="cccccc" w:sz="1"/>
+              <w:left w:val="single" w:color="cccccc" w:sz="1"/>
+              <w:bottom w:val="single" w:color="cccccc" w:sz="1"/>
+              <w:right w:val="single" w:color="cccccc" w:sz="1"/>
+            </w:tcBorders>
+            <w:shd w:fill="e8f0fe" w:val="clear"/>
+            <w:tcMar>
+              <w:top w:type="dxa" w:w="80"/>
+              <w:left w:type="dxa" w:w="120"/>
+              <w:bottom w:type="dxa" w:w="80"/>
+              <w:right w:type="dxa" w:w="120"/>
+            </w:tcMar>
+          </w:tcPr>
+          <w:p>
+            <w:r>
+              <w:rPr>
+                <w:rFonts w:ascii="Arial" w:cs="Arial" w:eastAsia="Arial" w:hAnsi="Arial"/>
+                <w:b/>
+                <w:bCs/>
+                <w:sz w:val="20"/>
+                <w:szCs w:val="20"/>
+              </w:rPr>
+              <w:t xml:space="preserve">Confidence floor</w:t>
+            </w:r>
+          </w:p>
+        </w:tc>
+        <w:tc>
+          <w:tcPr>
+            <w:tcW w:type="dxa" w:w="4526"/>
+            <w:tcBorders>
+              <w:top w:val="single" w:color="cccccc" w:sz="1"/>
+              <w:left w:val="single" w:color="cccccc" w:sz="1"/>
+              <w:bottom w:val="single" w:color="cccccc" w:sz="1"/>
+              <w:right w:val="single" w:color="cccccc" w:sz="1"/>
+            </w:tcBorders>
+            <w:shd w:fill="e8f0fe" w:val="clear"/>
+            <w:tcMar>
+              <w:top w:type="dxa" w:w="80"/>
+              <w:left w:type="dxa" w:w="120"/>
+              <w:bottom w:type="dxa" w:w="80"/>
+              <w:right w:type="dxa" w:w="120"/>
+            </w:tcMar>
+          </w:tcPr>
+          <w:p>
+            <w:r>
+              <w:rPr>
+                <w:rFonts w:ascii="Arial" w:cs="Arial" w:eastAsia="Arial" w:hAnsi="Arial"/>
+                <w:b/>
+                <w:bCs/>
+                <w:sz w:val="20"/>
+                <w:szCs w:val="20"/>
+              </w:rPr>
+              <w:t xml:space="preserve">Sample</w:t>
+            </w:r>
+          </w:p>
+        </w:tc>
+        <w:tc>
+          <w:tcPr>
+            <w:tcW w:type="dxa" w:w="4526"/>
+            <w:tcBorders>
+              <w:top w:val="single" w:color="cccccc" w:sz="1"/>
+              <w:left w:val="single" w:color="cccccc" w:sz="1"/>
+              <w:bottom w:val="single" w:color="cccccc" w:sz="1"/>
+              <w:right w:val="single" w:color="cccccc" w:sz="1"/>
+            </w:tcBorders>
+            <w:shd w:fill="e8f0fe" w:val="clear"/>
+            <w:tcMar>
+              <w:top w:type="dxa" w:w="80"/>
+              <w:left w:type="dxa" w:w="120"/>
+              <w:bottom w:type="dxa" w:w="80"/>
+              <w:right w:type="dxa" w:w="120"/>
+            </w:tcMar>
+          </w:tcPr>
+          <w:p>
+            <w:r>
+              <w:rPr>
+                <w:rFonts w:ascii="Arial" w:cs="Arial" w:eastAsia="Arial" w:hAnsi="Arial"/>
+                <w:b/>
+                <w:bCs/>
+                <w:sz w:val="20"/>
+                <w:szCs w:val="20"/>
+              </w:rPr>
+              <w:t xml:space="preserve">Accuracy</w:t>
+            </w:r>
+          </w:p>
+        </w:tc>
+      </w:tr>
+      <w:tr>
+        <w:tc>
+          <w:tcPr>
+            <w:tcW w:type="dxa" w:w="4500"/>
+            <w:tcBorders>
+              <w:top w:val="single" w:color="cccccc" w:sz="1"/>
+              <w:left w:val="single" w:color="cccccc" w:sz="1"/>
+              <w:bottom w:val="single" w:color="cccccc" w:sz="1"/>
+              <w:right w:val="single" w:color="cccccc" w:sz="1"/>
+            </w:tcBorders>
+            <w:shd w:fill="ffffff" w:val="clear"/>
+            <w:tcMar>
+              <w:top w:type="dxa" w:w="80"/>
+              <w:left w:type="dxa" w:w="120"/>
+              <w:bottom w:type="dxa" w:w="80"/>
+              <w:right w:type="dxa" w:w="120"/>
+            </w:tcMar>
+          </w:tcPr>
+          <w:p>
+            <w:r>
+              <w:rPr>
+                <w:rFonts w:ascii="Arial" w:cs="Arial" w:eastAsia="Arial" w:hAnsi="Arial"/>
+                <w:b w:val="false"/>
+                <w:bCs w:val="false"/>
+                <w:sz w:val="20"/>
+                <w:szCs w:val="20"/>
+              </w:rPr>
+              <w:t xml:space="preserve">Platinum</w:t>
+            </w:r>
+          </w:p>
+        </w:tc>
+        <w:tc>
+          <w:tcPr>
+            <w:tcW w:type="dxa" w:w="4526"/>
+            <w:tcBorders>
+              <w:top w:val="single" w:color="cccccc" w:sz="1"/>
+              <w:left w:val="single" w:color="cccccc" w:sz="1"/>
+              <w:bottom w:val="single" w:color="cccccc" w:sz="1"/>
+              <w:right w:val="single" w:color="cccccc" w:sz="1"/>
+            </w:tcBorders>
+            <w:shd w:fill="ffffff" w:val="clear"/>
+            <w:tcMar>
+              <w:top w:type="dxa" w:w="80"/>
+              <w:left w:type="dxa" w:w="120"/>
+              <w:bottom w:type="dxa" w:w="80"/>
+              <w:right w:type="dxa" w:w="120"/>
+            </w:tcMar>
+          </w:tcPr>
+          <w:p>
+            <w:r>
+              <w:rPr>
+                <w:rFonts w:ascii="Arial" w:cs="Arial" w:eastAsia="Arial" w:hAnsi="Arial"/>
+                <w:b w:val="false"/>
+                <w:bCs w:val="false"/>
+                <w:sz w:val="20"/>
+                <w:szCs w:val="20"/>
+              </w:rPr>
+              <w:t xml:space="preserve">Top 5 elite</w:t>
+            </w:r>
+          </w:p>
+        </w:tc>
+        <w:tc>
+          <w:tcPr>
+            <w:tcW w:type="dxa" w:w="4526"/>
+            <w:tcBorders>
+              <w:top w:val="single" w:color="cccccc" w:sz="1"/>
+              <w:left w:val="single" w:color="cccccc" w:sz="1"/>
+              <w:bottom w:val="single" w:color="cccccc" w:sz="1"/>
+              <w:right w:val="single" w:color="cccccc" w:sz="1"/>
+            </w:tcBorders>
+            <w:shd w:fill="ffffff" w:val="clear"/>
+            <w:tcMar>
+              <w:top w:type="dxa" w:w="80"/>
+              <w:left w:type="dxa" w:w="120"/>
+              <w:bottom w:type="dxa" w:w="80"/>
+              <w:right w:type="dxa" w:w="120"/>
+            </w:tcMar>
+          </w:tcPr>
+          <w:p>
+            <w:r>
+              <w:rPr>
+                <w:rFonts w:ascii="Arial" w:cs="Arial" w:eastAsia="Arial" w:hAnsi="Arial"/>
+                <w:b w:val="false"/>
+                <w:bCs w:val="false"/>
+                <w:sz w:val="20"/>
+                <w:szCs w:val="20"/>
+              </w:rPr>
+              <w:t xml:space="preserve">≥ 0.75</w:t>
+            </w:r>
+          </w:p>
+        </w:tc>
+        <w:tc>
+          <w:tcPr>
+            <w:tcW w:type="dxa" w:w="4526"/>
+            <w:tcBorders>
+              <w:top w:val="single" w:color="cccccc" w:sz="1"/>
+              <w:left w:val="single" w:color="cccccc" w:sz="1"/>
+              <w:bottom w:val="single" w:color="cccccc" w:sz="1"/>
+              <w:right w:val="single" w:color="cccccc" w:sz="1"/>
+            </w:tcBorders>
+            <w:shd w:fill="ffffff" w:val="clear"/>
+            <w:tcMar>
+              <w:top w:type="dxa" w:w="80"/>
+              <w:left w:type="dxa" w:w="120"/>
+              <w:bottom w:type="dxa" w:w="80"/>
+              <w:right w:type="dxa" w:w="120"/>
+            </w:tcMar>
+          </w:tcPr>
+          <w:p>
+            <w:r>
+              <w:rPr>
+                <w:rFonts w:ascii="Arial" w:cs="Arial" w:eastAsia="Arial" w:hAnsi="Arial"/>
+                <w:b w:val="false"/>
+                <w:bCs w:val="false"/>
+                <w:sz w:val="20"/>
+                <w:szCs w:val="20"/>
+              </w:rPr>
+              <w:t xml:space="preserve">840</w:t>
+            </w:r>
+          </w:p>
+        </w:tc>
+        <w:tc>
+          <w:tcPr>
+            <w:tcW w:type="dxa" w:w="4526"/>
+            <w:tcBorders>
+              <w:top w:val="single" w:color="cccccc" w:sz="1"/>
+              <w:left w:val="single" w:color="cccccc" w:sz="1"/>
+              <w:bottom w:val="single" w:color="cccccc" w:sz="1"/>
+              <w:right w:val="single" w:color="cccccc" w:sz="1"/>
+            </w:tcBorders>
+            <w:shd w:fill="ffffff" w:val="clear"/>
+            <w:tcMar>
+              <w:top w:type="dxa" w:w="80"/>
+              <w:left w:type="dxa" w:w="120"/>
+              <w:bottom w:type="dxa" w:w="80"/>
+              <w:right w:type="dxa" w:w="120"/>
+            </w:tcMar>
+          </w:tcPr>
+          <w:p>
+            <w:r>
+              <w:rPr>
+                <w:rFonts w:ascii="Arial" w:cs="Arial" w:eastAsia="Arial" w:hAnsi="Arial"/>
+                <w:b w:val="false"/>
+                <w:bCs w:val="false"/>
+                <w:sz w:val="20"/>
+                <w:szCs w:val="20"/>
+              </w:rPr>
+              <w:t xml:space="preserve">82.5%</w:t>
+            </w:r>
+          </w:p>
+        </w:tc>
+      </w:tr>
+      <w:tr>
+        <w:tc>
+          <w:tcPr>
+            <w:tcW w:type="dxa" w:w="4500"/>
+            <w:tcBorders>
+              <w:top w:val="single" w:color="cccccc" w:sz="1"/>
+              <w:left w:val="single" w:color="cccccc" w:sz="1"/>
+              <w:bottom w:val="single" w:color="cccccc" w:sz="1"/>
+              <w:right w:val="single" w:color="cccccc" w:sz="1"/>
+            </w:tcBorders>
+            <w:shd w:fill="ffffff" w:val="clear"/>
+            <w:tcMar>
+              <w:top w:type="dxa" w:w="80"/>
+              <w:left w:type="dxa" w:w="120"/>
+              <w:bottom w:type="dxa" w:w="80"/>
+              <w:right w:type="dxa" w:w="120"/>
+            </w:tcMar>
+          </w:tcPr>
+          <w:p>
+            <w:r>
+              <w:rPr>
+                <w:rFonts w:ascii="Arial" w:cs="Arial" w:eastAsia="Arial" w:hAnsi="Arial"/>
+                <w:b w:val="false"/>
+                <w:bCs w:val="false"/>
+                <w:sz w:val="20"/>
+                <w:szCs w:val="20"/>
+              </w:rPr>
+              <w:t xml:space="preserve">Gold</w:t>
+            </w:r>
+          </w:p>
+        </w:tc>
+        <w:tc>
+          <w:tcPr>
+            <w:tcW w:type="dxa" w:w="4526"/>
+            <w:tcBorders>
+              <w:top w:val="single" w:color="cccccc" w:sz="1"/>
+              <w:left w:val="single" w:color="cccccc" w:sz="1"/>
+              <w:bottom w:val="single" w:color="cccccc" w:sz="1"/>
+              <w:right w:val="single" w:color="cccccc" w:sz="1"/>
+            </w:tcBorders>
+            <w:shd w:fill="ffffff" w:val="clear"/>
+            <w:tcMar>
+              <w:top w:type="dxa" w:w="80"/>
+              <w:left w:type="dxa" w:w="120"/>
+              <w:bottom w:type="dxa" w:w="80"/>
+              <w:right w:type="dxa" w:w="120"/>
+            </w:tcMar>
+          </w:tcPr>
+          <w:p>
+            <w:r>
+              <w:rPr>
+                <w:rFonts w:ascii="Arial" w:cs="Arial" w:eastAsia="Arial" w:hAnsi="Arial"/>
+                <w:b w:val="false"/>
+                <w:bCs w:val="false"/>
+                <w:sz w:val="20"/>
+                <w:szCs w:val="20"/>
+              </w:rPr>
+              <w:t xml:space="preserve">Top 10</w:t>
+            </w:r>
+          </w:p>
+        </w:tc>
+        <w:tc>
+          <w:tcPr>
+            <w:tcW w:type="dxa" w:w="4526"/>
+            <w:tcBorders>
+              <w:top w:val="single" w:color="cccccc" w:sz="1"/>
+              <w:left w:val="single" w:color="cccccc" w:sz="1"/>
+              <w:bottom w:val="single" w:color="cccccc" w:sz="1"/>
+              <w:right w:val="single" w:color="cccccc" w:sz="1"/>
+            </w:tcBorders>
+            <w:shd w:fill="ffffff" w:val="clear"/>
+            <w:tcMar>
+              <w:top w:type="dxa" w:w="80"/>
+              <w:left w:type="dxa" w:w="120"/>
+              <w:bottom w:type="dxa" w:w="80"/>
+              <w:right w:type="dxa" w:w="120"/>
+            </w:tcMar>
+          </w:tcPr>
+          <w:p>
+            <w:r>
+              <w:rPr>
+                <w:rFonts w:ascii="Arial" w:cs="Arial" w:eastAsia="Arial" w:hAnsi="Arial"/>
+                <w:b w:val="false"/>
+                <w:bCs w:val="false"/>
+                <w:sz w:val="20"/>
+                <w:szCs w:val="20"/>
+              </w:rPr>
+              <w:t xml:space="preserve">≥ 0.70</w:t>
+            </w:r>
+          </w:p>
+        </w:tc>
+        <w:tc>
+          <w:tcPr>
+            <w:tcW w:type="dxa" w:w="4526"/>
+            <w:tcBorders>
+              <w:top w:val="single" w:color="cccccc" w:sz="1"/>
+              <w:left w:val="single" w:color="cccccc" w:sz="1"/>
+              <w:bottom w:val="single" w:color="cccccc" w:sz="1"/>
+              <w:right w:val="single" w:color="cccccc" w:sz="1"/>
+            </w:tcBorders>
+            <w:shd w:fill="ffffff" w:val="clear"/>
+            <w:tcMar>
+              <w:top w:type="dxa" w:w="80"/>
+              <w:left w:type="dxa" w:w="120"/>
+              <w:bottom w:type="dxa" w:w="80"/>
+              <w:right w:type="dxa" w:w="120"/>
+            </w:tcMar>
+          </w:tcPr>
+          <w:p>
+            <w:r>
+              <w:rPr>
+                <w:rFonts w:ascii="Arial" w:cs="Arial" w:eastAsia="Arial" w:hAnsi="Arial"/>
+                <w:b w:val="false"/>
+                <w:bCs w:val="false"/>
+                <w:sz w:val="20"/>
+                <w:szCs w:val="20"/>
+              </w:rPr>
+              <w:t xml:space="preserve">1,650</w:t>
+            </w:r>
+          </w:p>
+        </w:tc>
+        <w:tc>
+          <w:tcPr>
+            <w:tcW w:type="dxa" w:w="4526"/>
+            <w:tcBorders>
+              <w:top w:val="single" w:color="cccccc" w:sz="1"/>
+              <w:left w:val="single" w:color="cccccc" w:sz="1"/>
+              <w:bottom w:val="single" w:color="cccccc" w:sz="1"/>
+              <w:right w:val="single" w:color="cccccc" w:sz="1"/>
+            </w:tcBorders>
+            <w:shd w:fill="ffffff" w:val="clear"/>
+            <w:tcMar>
+              <w:top w:type="dxa" w:w="80"/>
+              <w:left w:type="dxa" w:w="120"/>
+              <w:bottom w:type="dxa" w:w="80"/>
+              <w:right w:type="dxa" w:w="120"/>
+            </w:tcMar>
+          </w:tcPr>
+          <w:p>
+            <w:r>
+              <w:rPr>
+                <w:rFonts w:ascii="Arial" w:cs="Arial" w:eastAsia="Arial" w:hAnsi="Arial"/>
+                <w:b w:val="false"/>
+                <w:bCs w:val="false"/>
+                <w:sz w:val="20"/>
+                <w:szCs w:val="20"/>
+              </w:rPr>
+              <w:t xml:space="preserve">71.7%</w:t>
+            </w:r>
+          </w:p>
+        </w:tc>
+      </w:tr>
+      <w:tr>
+        <w:tc>
+          <w:tcPr>
+            <w:tcW w:type="dxa" w:w="4500"/>
+            <w:tcBorders>
+              <w:top w:val="single" w:color="cccccc" w:sz="1"/>
+              <w:left w:val="single" w:color="cccccc" w:sz="1"/>
+              <w:bottom w:val="single" w:color="cccccc" w:sz="1"/>
+              <w:right w:val="single" w:color="cccccc" w:sz="1"/>
+            </w:tcBorders>
+            <w:shd w:fill="ffffff" w:val="clear"/>
+            <w:tcMar>
+              <w:top w:type="dxa" w:w="80"/>
+              <w:left w:type="dxa" w:w="120"/>
+              <w:bottom w:type="dxa" w:w="80"/>
+              <w:right w:type="dxa" w:w="120"/>
+            </w:tcMar>
+          </w:tcPr>
+          <w:p>
+            <w:r>
+              <w:rPr>
+                <w:rFonts w:ascii="Arial" w:cs="Arial" w:eastAsia="Arial" w:hAnsi="Arial"/>
+                <w:b w:val="false"/>
+                <w:bCs w:val="false"/>
+                <w:sz w:val="20"/>
+                <w:szCs w:val="20"/>
+              </w:rPr>
+              <w:t xml:space="preserve">Silver</w:t>
+            </w:r>
+          </w:p>
+        </w:tc>
+        <w:tc>
+          <w:tcPr>
+            <w:tcW w:type="dxa" w:w="4526"/>
+            <w:tcBorders>
+              <w:top w:val="single" w:color="cccccc" w:sz="1"/>
+              <w:left w:val="single" w:color="cccccc" w:sz="1"/>
+              <w:bottom w:val="single" w:color="cccccc" w:sz="1"/>
+              <w:right w:val="single" w:color="cccccc" w:sz="1"/>
+            </w:tcBorders>
+            <w:shd w:fill="ffffff" w:val="clear"/>
+            <w:tcMar>
+              <w:top w:type="dxa" w:w="80"/>
+              <w:left w:type="dxa" w:w="120"/>
+              <w:bottom w:type="dxa" w:w="80"/>
+              <w:right w:type="dxa" w:w="120"/>
+            </w:tcMar>
+          </w:tcPr>
+          <w:p>
+            <w:r>
+              <w:rPr>
+                <w:rFonts w:ascii="Arial" w:cs="Arial" w:eastAsia="Arial" w:hAnsi="Arial"/>
+                <w:b w:val="false"/>
+                <w:bCs w:val="false"/>
+                <w:sz w:val="20"/>
+                <w:szCs w:val="20"/>
+              </w:rPr>
+              <w:t xml:space="preserve">Top 14</w:t>
+            </w:r>
+          </w:p>
+        </w:tc>
+        <w:tc>
+          <w:tcPr>
+            <w:tcW w:type="dxa" w:w="4526"/>
+            <w:tcBorders>
+              <w:top w:val="single" w:color="cccccc" w:sz="1"/>
+              <w:left w:val="single" w:color="cccccc" w:sz="1"/>
+              <w:bottom w:val="single" w:color="cccccc" w:sz="1"/>
+              <w:right w:val="single" w:color="cccccc" w:sz="1"/>
+            </w:tcBorders>
+            <w:shd w:fill="ffffff" w:val="clear"/>
+            <w:tcMar>
+              <w:top w:type="dxa" w:w="80"/>
+              <w:left w:type="dxa" w:w="120"/>
+              <w:bottom w:type="dxa" w:w="80"/>
+              <w:right w:type="dxa" w:w="120"/>
+            </w:tcMar>
+          </w:tcPr>
+          <w:p>
+            <w:r>
+              <w:rPr>
+                <w:rFonts w:ascii="Arial" w:cs="Arial" w:eastAsia="Arial" w:hAnsi="Arial"/>
+                <w:b w:val="false"/>
+                <w:bCs w:val="false"/>
+                <w:sz w:val="20"/>
+                <w:szCs w:val="20"/>
+              </w:rPr>
+              <w:t xml:space="preserve">≥ 0.65</w:t>
+            </w:r>
+          </w:p>
+        </w:tc>
+        <w:tc>
+          <w:tcPr>
+            <w:tcW w:type="dxa" w:w="4526"/>
+            <w:tcBorders>
+              <w:top w:val="single" w:color="cccccc" w:sz="1"/>
+              <w:left w:val="single" w:color="cccccc" w:sz="1"/>
+              <w:bottom w:val="single" w:color="cccccc" w:sz="1"/>
+              <w:right w:val="single" w:color="cccccc" w:sz="1"/>
+            </w:tcBorders>
+            <w:shd w:fill="ffffff" w:val="clear"/>
+            <w:tcMar>
+              <w:top w:type="dxa" w:w="80"/>
+              <w:left w:type="dxa" w:w="120"/>
+              <w:bottom w:type="dxa" w:w="80"/>
+              <w:right w:type="dxa" w:w="120"/>
+            </w:tcMar>
+          </w:tcPr>
+          <w:p>
+            <w:r>
+              <w:rPr>
+                <w:rFonts w:ascii="Arial" w:cs="Arial" w:eastAsia="Arial" w:hAnsi="Arial"/>
+                <w:b w:val="false"/>
+                <w:bCs w:val="false"/>
+                <w:sz w:val="20"/>
+                <w:szCs w:val="20"/>
+              </w:rPr>
+              <w:t xml:space="preserve">3,004</w:t>
+            </w:r>
+          </w:p>
+        </w:tc>
+        <w:tc>
+          <w:tcPr>
+            <w:tcW w:type="dxa" w:w="4526"/>
+            <w:tcBorders>
+              <w:top w:val="single" w:color="cccccc" w:sz="1"/>
+              <w:left w:val="single" w:color="cccccc" w:sz="1"/>
+              <w:bottom w:val="single" w:color="cccccc" w:sz="1"/>
+              <w:right w:val="single" w:color="cccccc" w:sz="1"/>
+            </w:tcBorders>
+            <w:shd w:fill="ffffff" w:val="clear"/>
+            <w:tcMar>
+              <w:top w:type="dxa" w:w="80"/>
+              <w:left w:type="dxa" w:w="120"/>
+              <w:bottom w:type="dxa" w:w="80"/>
+              <w:right w:type="dxa" w:w="120"/>
+            </w:tcMar>
+          </w:tcPr>
+          <w:p>
+            <w:r>
+              <w:rPr>
+                <w:rFonts w:ascii="Arial" w:cs="Arial" w:eastAsia="Arial" w:hAnsi="Arial"/>
+                <w:b w:val="false"/>
+                <w:bCs w:val="false"/>
+                <w:sz w:val="20"/>
+                <w:szCs w:val="20"/>
+              </w:rPr>
+              <w:t xml:space="preserve">60%+</w:t>
+            </w:r>
+          </w:p>
+        </w:tc>
+      </w:tr>
+      <w:tr>
+        <w:tc>
+          <w:tcPr>
+            <w:tcW w:type="dxa" w:w="4500"/>
+            <w:tcBorders>
+              <w:top w:val="single" w:color="cccccc" w:sz="1"/>
+              <w:left w:val="single" w:color="cccccc" w:sz="1"/>
+              <w:bottom w:val="single" w:color="cccccc" w:sz="1"/>
+              <w:right w:val="single" w:color="cccccc" w:sz="1"/>
+            </w:tcBorders>
+            <w:shd w:fill="ffffff" w:val="clear"/>
+            <w:tcMar>
+              <w:top w:type="dxa" w:w="80"/>
+              <w:left w:type="dxa" w:w="120"/>
+              <w:bottom w:type="dxa" w:w="80"/>
+              <w:right w:type="dxa" w:w="120"/>
+            </w:tcMar>
+          </w:tcPr>
+          <w:p>
+            <w:r>
+              <w:rPr>
+                <w:rFonts w:ascii="Arial" w:cs="Arial" w:eastAsia="Arial" w:hAnsi="Arial"/>
+                <w:b w:val="false"/>
+                <w:bCs w:val="false"/>
+                <w:sz w:val="20"/>
+                <w:szCs w:val="20"/>
+              </w:rPr>
+              <w:t xml:space="preserve">Free</w:t>
+            </w:r>
+          </w:p>
+        </w:tc>
+        <w:tc>
+          <w:tcPr>
+            <w:tcW w:type="dxa" w:w="4526"/>
+            <w:tcBorders>
+              <w:top w:val="single" w:color="cccccc" w:sz="1"/>
+              <w:left w:val="single" w:color="cccccc" w:sz="1"/>
+              <w:bottom w:val="single" w:color="cccccc" w:sz="1"/>
+              <w:right w:val="single" w:color="cccccc" w:sz="1"/>
+            </w:tcBorders>
+            <w:shd w:fill="ffffff" w:val="clear"/>
+            <w:tcMar>
+              <w:top w:type="dxa" w:w="80"/>
+              <w:left w:type="dxa" w:w="120"/>
+              <w:bottom w:type="dxa" w:w="80"/>
+              <w:right w:type="dxa" w:w="120"/>
+            </w:tcMar>
+          </w:tcPr>
+          <w:p>
+            <w:r>
+              <w:rPr>
+                <w:rFonts w:ascii="Arial" w:cs="Arial" w:eastAsia="Arial" w:hAnsi="Arial"/>
+                <w:b w:val="false"/>
+                <w:bCs w:val="false"/>
+                <w:sz w:val="20"/>
+                <w:szCs w:val="20"/>
+              </w:rPr>
+              <w:t xml:space="preserve">Top 14</w:t>
+            </w:r>
+          </w:p>
+        </w:tc>
+        <w:tc>
+          <w:tcPr>
+            <w:tcW w:type="dxa" w:w="4526"/>
+            <w:tcBorders>
+              <w:top w:val="single" w:color="cccccc" w:sz="1"/>
+              <w:left w:val="single" w:color="cccccc" w:sz="1"/>
+              <w:bottom w:val="single" w:color="cccccc" w:sz="1"/>
+              <w:right w:val="single" w:color="cccccc" w:sz="1"/>
+            </w:tcBorders>
+            <w:shd w:fill="ffffff" w:val="clear"/>
+            <w:tcMar>
+              <w:top w:type="dxa" w:w="80"/>
+              <w:left w:type="dxa" w:w="120"/>
+              <w:bottom w:type="dxa" w:w="80"/>
+              <w:right w:type="dxa" w:w="120"/>
+            </w:tcMar>
+          </w:tcPr>
+          <w:p>
+            <w:r>
+              <w:rPr>
+                <w:rFonts w:ascii="Arial" w:cs="Arial" w:eastAsia="Arial" w:hAnsi="Arial"/>
+                <w:b w:val="false"/>
+                <w:bCs w:val="false"/>
+                <w:sz w:val="20"/>
+                <w:szCs w:val="20"/>
+              </w:rPr>
+              <w:t xml:space="preserve">≥ 0.55</w:t>
+            </w:r>
+          </w:p>
+        </w:tc>
+        <w:tc>
+          <w:tcPr>
+            <w:tcW w:type="dxa" w:w="4526"/>
+            <w:tcBorders>
+              <w:top w:val="single" w:color="cccccc" w:sz="1"/>
+              <w:left w:val="single" w:color="cccccc" w:sz="1"/>
+              <w:bottom w:val="single" w:color="cccccc" w:sz="1"/>
+              <w:right w:val="single" w:color="cccccc" w:sz="1"/>
+            </w:tcBorders>
+            <w:shd w:fill="ffffff" w:val="clear"/>
+            <w:tcMar>
+              <w:top w:type="dxa" w:w="80"/>
+              <w:left w:type="dxa" w:w="120"/>
+              <w:bottom w:type="dxa" w:w="80"/>
+              <w:right w:type="dxa" w:w="120"/>
+            </w:tcMar>
+          </w:tcPr>
+          <w:p>
+            <w:r>
+              <w:rPr>
+                <w:rFonts w:ascii="Arial" w:cs="Arial" w:eastAsia="Arial" w:hAnsi="Arial"/>
+                <w:b w:val="false"/>
+                <w:bCs w:val="false"/>
+                <w:sz w:val="20"/>
+                <w:szCs w:val="20"/>
+              </w:rPr>
+              <w:t xml:space="preserve">3,763</w:t>
+            </w:r>
+          </w:p>
+        </w:tc>
+        <w:tc>
+          <w:tcPr>
+            <w:tcW w:type="dxa" w:w="4526"/>
+            <w:tcBorders>
+              <w:top w:val="single" w:color="cccccc" w:sz="1"/>
+              <w:left w:val="single" w:color="cccccc" w:sz="1"/>
+              <w:bottom w:val="single" w:color="cccccc" w:sz="1"/>
+              <w:right w:val="single" w:color="cccccc" w:sz="1"/>
+            </w:tcBorders>
+            <w:shd w:fill="ffffff" w:val="clear"/>
+            <w:tcMar>
+              <w:top w:type="dxa" w:w="80"/>
+              <w:left w:type="dxa" w:w="120"/>
+              <w:bottom w:type="dxa" w:w="80"/>
+              <w:right w:type="dxa" w:w="120"/>
+            </w:tcMar>
+          </w:tcPr>
+          <w:p>
+            <w:r>
+              <w:rPr>
+                <w:rFonts w:ascii="Arial" w:cs="Arial" w:eastAsia="Arial" w:hAnsi="Arial"/>
+                <w:b w:val="false"/>
+                <w:bCs w:val="false"/>
+                <w:sz w:val="20"/>
+                <w:szCs w:val="20"/>
+              </w:rPr>
+              <w:t xml:space="preserve">48.4%</w:t>
+            </w:r>
+          </w:p>
+        </w:tc>
+      </w:tr>
+    </w:tbl>
+    <w:p>
+      <w:pPr>
+        <w:spacing w:after="140" w:line="320"/>
+      </w:pPr>
+      <w:r>
+        <w:rPr>
+          <w:rFonts w:ascii="Arial" w:cs="Arial" w:eastAsia="Arial" w:hAnsi="Arial"/>
+          <w:sz w:val="22"/>
+          <w:szCs w:val="22"/>
+        </w:rPr>
+        <w:t xml:space="preserve">Interpretation: raw accuracy is modest because football 1X2 is hard (33% random baseline, ~50% best-case for all picks). Real value lies in confidence filtering — the model correctly abstains on uncertain matches. At ≥ 75% confidence, 78.2% walk-forward / 82.5% live-v8.1 accuracy represents a genuine edge.</w:t>
       </w:r>
     </w:p>
     <w:p>
@@ -4505,7 +5295,7 @@
           <w:sz w:val="22"/>
           <w:szCs w:val="22"/>
         </w:rPr>
-        <w:t xml:space="preserve">Celery beat scheduler generates predictions continuously:</w:t>
+        <w:t xml:space="preserve">APScheduler (running in-process with FastAPI on Railway) generates predictions continuously:</w:t>
       </w:r>
     </w:p>
     <w:p>
@@ -4523,7 +5313,7 @@
           <w:sz w:val="22"/>
           <w:szCs w:val="22"/>
         </w:rPr>
-        <w:t xml:space="preserve">Every 5 minutes: sync_upcoming_matches (new fixtures)</w:t>
+        <w:t xml:space="preserve">Every 6 hours: job_sync_data (upcoming + results + standings, 7 leagues per cycle)</w:t>
       </w:r>
     </w:p>
     <w:p>
@@ -4541,7 +5331,7 @@
           <w:sz w:val="22"/>
           <w:szCs w:val="22"/>
         </w:rPr>
-        <w:t xml:space="preserve">Every 5 minutes: sync_recent_results (final scores)</w:t>
+        <w:t xml:space="preserve">Every 10 minutes: job_generate_predictions (v8.1 forecast for upcoming matches without one)</w:t>
       </w:r>
     </w:p>
     <w:p>
@@ -4559,7 +5349,7 @@
           <w:sz w:val="22"/>
           <w:szCs w:val="22"/>
         </w:rPr>
-        <w:t xml:space="preserve">Every 5 minutes: generate_predictions_for_upcoming (predictions for matches without one)</w:t>
+        <w:t xml:space="preserve">Every 20 minutes: job_evaluate_predictions (score finished matches)</w:t>
       </w:r>
     </w:p>
     <w:p>
@@ -4577,12 +5367,17 @@
           <w:sz w:val="22"/>
           <w:szCs w:val="22"/>
         </w:rPr>
-        <w:t xml:space="preserve">Every 30 minutes: sync_standings (league tables)</w:t>
-      </w:r>
-    </w:p>
-    <w:p>
-      <w:pPr>
-        <w:spacing w:after="140" w:line="320"/>
+        <w:t xml:space="preserve">Every 5 minutes: job_generate_historical_predictions (backtest backfill, 100 per batch)</w:t>
+      </w:r>
+    </w:p>
+    <w:p>
+      <w:pPr>
+        <w:pStyle w:val="ListParagraph"/>
+        <w:numPr>
+          <w:ilvl w:val="0"/>
+          <w:numId w:val="2"/>
+        </w:numPr>
+        <w:spacing w:after="80" w:line="320"/>
       </w:pPr>
       <w:r>
         <w:rPr>
@@ -4590,7 +5385,20 @@
           <w:sz w:val="22"/>
           <w:szCs w:val="22"/>
         </w:rPr>
-        <w:t xml:space="preserve">No manual intervention required. New matches automatically receive v8 predictions within 5-10 minutes of becoming available in API-Football.</w:t>
+        <w:t xml:space="preserve">Immediately after sync: chained generate_predictions so new fixtures never wait a full cycle</w:t>
+      </w:r>
+    </w:p>
+    <w:p>
+      <w:pPr>
+        <w:spacing w:after="140" w:line="320"/>
+      </w:pPr>
+      <w:r>
+        <w:rPr>
+          <w:rFonts w:ascii="Arial" w:cs="Arial" w:eastAsia="Arial" w:hAnsi="Arial"/>
+          <w:sz w:val="22"/>
+          <w:szCs w:val="22"/>
+        </w:rPr>
+        <w:t xml:space="preserve">No manual intervention required. New matches receive v8.1 predictions within 10 minutes of ingestion.</w:t>
       </w:r>
     </w:p>
     <w:p>

</xml_diff>

<commit_message>
docs: sync legal + technical frameworks with current product state
Legal (EN + NL): renamed the free tier from "Free" to "Bronze" in the section 7.1 subscription-tier list so customer-facing copy matches the pricing page and tier-theme.ts. The "free" string remains as an internal backend slug only.

Technical (EN + NL) section 2.1 stack table: Python 3.11+ -> 3.12, PostgreSQL 18.3 -> 16, Next.js 15/React 19 -> Next.js 14/React 18. Backend + cache/queue rows expanded with FastAPI 0.115, asyncpg and Celery 5 so the table reflects what actually ships. Section 4.3 live-tier row relabelled Bronze (Free) for consistency.

All four .docx regenerated.

Co-Authored-By: Claude Opus 4.7 (1M context) <noreply@anthropic.com>
</commit_message>
<xml_diff>
--- a/docs/BetsPlug-Technical-Framework (ENG).docx
+++ b/docs/BetsPlug-Technical-Framework (ENG).docx
@@ -369,7 +369,7 @@
                 <w:sz w:val="20"/>
                 <w:szCs w:val="20"/>
               </w:rPr>
-              <w:t xml:space="preserve">FastAPI (Python 3.11+), SQLAlchemy 2.0 async</w:t>
+              <w:t xml:space="preserve">FastAPI 0.115 (Python 3.12), SQLAlchemy 2 async (asyncpg)</w:t>
             </w:r>
           </w:p>
         </w:tc>
@@ -431,7 +431,7 @@
                 <w:sz w:val="20"/>
                 <w:szCs w:val="20"/>
               </w:rPr>
-              <w:t xml:space="preserve">PostgreSQL 18.3, 5 GB persistent volume</w:t>
+              <w:t xml:space="preserve">PostgreSQL 16, 5 GB persistent volume</w:t>
             </w:r>
           </w:p>
         </w:tc>
@@ -493,7 +493,7 @@
                 <w:sz w:val="20"/>
                 <w:szCs w:val="20"/>
               </w:rPr>
-              <w:t xml:space="preserve">Redis 7 (Celery broker + result backend)</w:t>
+              <w:t xml:space="preserve">Redis 7 (Celery 5 broker + result backend)</w:t>
             </w:r>
           </w:p>
         </w:tc>
@@ -555,7 +555,7 @@
                 <w:sz w:val="20"/>
                 <w:szCs w:val="20"/>
               </w:rPr>
-              <w:t xml:space="preserve">Next.js 15, React 19, TypeScript, Tailwind</w:t>
+              <w:t xml:space="preserve">Next.js 14, React 18, TypeScript, Tailwind</w:t>
             </w:r>
           </w:p>
         </w:tc>
@@ -4992,7 +4992,7 @@
                 <w:sz w:val="20"/>
                 <w:szCs w:val="20"/>
               </w:rPr>
-              <w:t xml:space="preserve">Free</w:t>
+              <w:t xml:space="preserve">Bronze (Free)</w:t>
             </w:r>
           </w:p>
         </w:tc>

</xml_diff>